<commit_message>
Update report for wrong draft
</commit_message>
<xml_diff>
--- a/Report.docx
+++ b/Report.docx
@@ -709,23 +709,59 @@
         <w:rPr>
           <w:rFonts w:ascii="Times New Roman" w:hAnsi="Times New Roman" w:cs="Times New Roman"/>
         </w:rPr>
-        <w:t>This chatbot system had build by AI and API of OpenAI</w:t>
-      </w:r>
-      <w:r>
-        <w:rPr>
-          <w:rFonts w:ascii="Times New Roman" w:hAnsi="Times New Roman" w:cs="Times New Roman"/>
-        </w:rPr>
-        <w:t>, Google Gemini.</w:t>
+        <w:t xml:space="preserve">This chatbot system had build by AI and API of </w:t>
+      </w:r>
+      <w:del w:id="1" w:author="HP" w:date="2026-03-19T10:45:00Z">
+        <w:r>
+          <w:rPr>
+            <w:rFonts w:ascii="Times New Roman" w:hAnsi="Times New Roman" w:cs="Times New Roman"/>
+          </w:rPr>
+          <w:delText>OpenAI</w:delText>
+        </w:r>
+        <w:r>
+          <w:rPr>
+            <w:rFonts w:ascii="Times New Roman" w:hAnsi="Times New Roman" w:cs="Times New Roman"/>
+          </w:rPr>
+          <w:delText xml:space="preserve">, </w:delText>
+        </w:r>
+      </w:del>
+      <w:r>
+        <w:rPr>
+          <w:rFonts w:ascii="Times New Roman" w:hAnsi="Times New Roman" w:cs="Times New Roman"/>
+        </w:rPr>
+        <w:t>Google Gemini</w:t>
+      </w:r>
+      <w:ins w:id="2" w:author="HP" w:date="2026-03-19T10:45:00Z">
+        <w:r>
+          <w:rPr>
+            <w:rFonts w:ascii="Times New Roman" w:hAnsi="Times New Roman" w:cs="Times New Roman"/>
+          </w:rPr>
+          <w:t>, application for people who want to get know more information a</w:t>
+        </w:r>
+      </w:ins>
+      <w:ins w:id="3" w:author="HP" w:date="2026-03-19T10:46:00Z">
+        <w:r>
+          <w:rPr>
+            <w:rFonts w:ascii="Times New Roman" w:hAnsi="Times New Roman" w:cs="Times New Roman"/>
+          </w:rPr>
+          <w:t>bout traffic law and application law in many condition</w:t>
+        </w:r>
+      </w:ins>
+      <w:r>
+        <w:rPr>
+          <w:rFonts w:ascii="Times New Roman" w:hAnsi="Times New Roman" w:cs="Times New Roman"/>
+        </w:rPr>
+        <w:t>.</w:t>
       </w:r>
     </w:p>
     <w:p>
       <w:pPr>
         <w:pStyle w:val="Heading1"/>
-        <w:pPrChange w:id="1" w:author="HP" w:date="2026-03-19T10:22:00Z">
+        <w:pPrChange w:id="4" w:author="HP" w:date="2026-03-19T10:22:00Z">
           <w:pPr/>
         </w:pPrChange>
       </w:pPr>
-      <w:ins w:id="2" w:author="HP" w:date="2026-03-19T10:22:00Z">
+      <w:ins w:id="5" w:author="HP" w:date="2026-03-19T10:22:00Z">
         <w:r>
           <w:t>II Infomation</w:t>
         </w:r>
@@ -735,12 +771,12 @@
       <w:pPr>
         <w:pStyle w:val="Heading2"/>
       </w:pPr>
-      <w:ins w:id="3" w:author="HP" w:date="2026-03-19T10:22:00Z">
+      <w:ins w:id="6" w:author="HP" w:date="2026-03-19T10:22:00Z">
         <w:r>
           <w:t>2</w:t>
         </w:r>
       </w:ins>
-      <w:del w:id="4" w:author="HP" w:date="2026-03-19T10:22:00Z">
+      <w:del w:id="7" w:author="HP" w:date="2026-03-19T10:22:00Z">
         <w:r>
           <w:delText>1</w:delText>
         </w:r>
@@ -754,20 +790,32 @@
         <w:t>Name : VietNamese Traffic Law Consulation</w:t>
       </w:r>
     </w:p>
+    <w:p>
+      <w:pPr>
+        <w:rPr>
+          <w:ins w:id="8" w:author="HP" w:date="2026-03-19T10:47:00Z"/>
+        </w:rPr>
+      </w:pPr>
+      <w:ins w:id="9" w:author="HP" w:date="2026-03-19T10:47:00Z">
+        <w:r>
+          <w:t>Website : none</w:t>
+        </w:r>
+      </w:ins>
+    </w:p>
     <w:p/>
     <w:p>
       <w:pPr>
         <w:pStyle w:val="Heading2"/>
-        <w:pPrChange w:id="5" w:author="HP" w:date="2026-03-19T10:22:00Z">
+        <w:pPrChange w:id="10" w:author="HP" w:date="2026-03-19T10:22:00Z">
           <w:pPr/>
         </w:pPrChange>
       </w:pPr>
-      <w:ins w:id="6" w:author="HP" w:date="2026-03-19T10:22:00Z">
+      <w:ins w:id="11" w:author="HP" w:date="2026-03-19T10:22:00Z">
         <w:r>
           <w:t>2</w:t>
         </w:r>
       </w:ins>
-      <w:del w:id="7" w:author="HP" w:date="2026-03-19T10:22:00Z">
+      <w:del w:id="12" w:author="HP" w:date="2026-03-19T10:22:00Z">
         <w:r>
           <w:delText>1</w:delText>
         </w:r>
@@ -780,16 +828,16 @@
       <w:pPr>
         <w:spacing w:before="0" w:after="0" w:line="315" w:lineRule="atLeast"/>
         <w:rPr>
-          <w:ins w:id="8" w:author="HP" w:date="2026-03-19T10:15:00Z"/>
+          <w:ins w:id="13" w:author="HP" w:date="2026-03-19T10:15:00Z"/>
           <w:rFonts w:ascii="Roboto" w:eastAsia="Times New Roman" w:hAnsi="Roboto" w:cs="Arial"/>
           <w:color w:val="62748D"/>
           <w:kern w:val="0"/>
           <w:sz w:val="23"/>
           <w:szCs w:val="23"/>
           <w14:ligatures w14:val="none"/>
-          <w:rPrChange w:id="9" w:author="HP" w:date="2026-03-19T10:20:00Z">
+          <w:rPrChange w:id="14" w:author="HP" w:date="2026-03-19T10:20:00Z">
             <w:rPr>
-              <w:ins w:id="10" w:author="HP" w:date="2026-03-19T10:15:00Z"/>
+              <w:ins w:id="15" w:author="HP" w:date="2026-03-19T10:15:00Z"/>
               <w:rFonts w:ascii="Roboto" w:eastAsia="Times New Roman" w:hAnsi="Roboto" w:cs="Arial"/>
               <w:color w:val="182940"/>
               <w:kern w:val="0"/>
@@ -803,12 +851,12 @@
       <w:r>
         <w:t>Arrcording to</w:t>
       </w:r>
-      <w:del w:id="11" w:author="HP" w:date="2026-03-19T10:12:00Z">
+      <w:del w:id="16" w:author="HP" w:date="2026-03-19T10:12:00Z">
         <w:r>
           <w:delText xml:space="preserve"> </w:delText>
         </w:r>
       </w:del>
-      <w:ins w:id="12" w:author="HP" w:date="2026-03-19T10:12:00Z">
+      <w:ins w:id="17" w:author="HP" w:date="2026-03-19T10:12:00Z">
         <w:r>
           <w:t xml:space="preserve"> Thư viện pháp luật ( </w:t>
         </w:r>
@@ -834,7 +882,7 @@
           <w:t xml:space="preserve"> ),</w:t>
         </w:r>
       </w:ins>
-      <w:ins w:id="13" w:author="HP" w:date="2026-03-19T10:13:00Z">
+      <w:ins w:id="18" w:author="HP" w:date="2026-03-19T10:13:00Z">
         <w:r>
           <w:t>National Databases about Law (</w:t>
         </w:r>
@@ -866,22 +914,22 @@
           <w:t xml:space="preserve">) </w:t>
         </w:r>
       </w:ins>
-      <w:ins w:id="14" w:author="HP" w:date="2026-03-19T10:14:00Z">
+      <w:ins w:id="19" w:author="HP" w:date="2026-03-19T10:14:00Z">
         <w:r>
           <w:t>and VietNamese Minstry of</w:t>
         </w:r>
       </w:ins>
-      <w:ins w:id="15" w:author="HP" w:date="2026-03-19T10:35:00Z">
+      <w:ins w:id="20" w:author="HP" w:date="2026-03-19T10:35:00Z">
         <w:r>
           <w:t xml:space="preserve"> </w:t>
         </w:r>
       </w:ins>
-      <w:ins w:id="16" w:author="HP" w:date="2026-03-19T10:14:00Z">
+      <w:ins w:id="21" w:author="HP" w:date="2026-03-19T10:14:00Z">
         <w:r>
           <w:t>Transport(</w:t>
         </w:r>
       </w:ins>
-      <w:ins w:id="17" w:author="HP" w:date="2026-03-19T10:19:00Z">
+      <w:ins w:id="22" w:author="HP" w:date="2026-03-19T10:19:00Z">
         <w:r>
           <w:rPr>
             <w:rFonts w:ascii="Roboto" w:eastAsia="Times New Roman" w:hAnsi="Roboto" w:cs="Arial"/>
@@ -907,7 +955,7 @@
           <w:instrText xml:space="preserve"> HYPERLINK "</w:instrText>
         </w:r>
       </w:ins>
-      <w:ins w:id="18" w:author="HP" w:date="2026-03-19T10:15:00Z">
+      <w:ins w:id="23" w:author="HP" w:date="2026-03-19T10:15:00Z">
         <w:r>
           <w:rPr>
             <w:rFonts w:ascii="Roboto" w:eastAsia="Times New Roman" w:hAnsi="Roboto" w:cs="Arial"/>
@@ -921,7 +969,7 @@
           <w:instrText>http://www.mt.gov.vn</w:instrText>
         </w:r>
       </w:ins>
-      <w:ins w:id="19" w:author="HP" w:date="2026-03-19T10:19:00Z">
+      <w:ins w:id="24" w:author="HP" w:date="2026-03-19T10:19:00Z">
         <w:r>
           <w:rPr>
             <w:rFonts w:ascii="Roboto" w:eastAsia="Times New Roman" w:hAnsi="Roboto" w:cs="Arial"/>
@@ -947,7 +995,7 @@
           <w:fldChar w:fldCharType="separate"/>
         </w:r>
       </w:ins>
-      <w:ins w:id="20" w:author="HP" w:date="2026-03-19T10:15:00Z">
+      <w:ins w:id="25" w:author="HP" w:date="2026-03-19T10:15:00Z">
         <w:r>
           <w:rPr>
             <w:rStyle w:val="Hyperlink"/>
@@ -960,7 +1008,7 @@
           <w:t>http://www.mt.gov.vn</w:t>
         </w:r>
       </w:ins>
-      <w:ins w:id="21" w:author="HP" w:date="2026-03-19T10:19:00Z">
+      <w:ins w:id="26" w:author="HP" w:date="2026-03-19T10:19:00Z">
         <w:r>
           <w:rPr>
             <w:rFonts w:ascii="Roboto" w:eastAsia="Times New Roman" w:hAnsi="Roboto" w:cs="Arial"/>
@@ -974,7 +1022,7 @@
           <w:fldChar w:fldCharType="end"/>
         </w:r>
       </w:ins>
-      <w:ins w:id="22" w:author="HP" w:date="2026-03-19T10:15:00Z">
+      <w:ins w:id="27" w:author="HP" w:date="2026-03-19T10:15:00Z">
         <w:r>
           <w:rPr>
             <w:rFonts w:ascii="Roboto" w:eastAsia="Times New Roman" w:hAnsi="Roboto" w:cs="Arial"/>
@@ -987,7 +1035,7 @@
           <w:t>)</w:t>
         </w:r>
       </w:ins>
-      <w:ins w:id="23" w:author="HP" w:date="2026-03-19T10:19:00Z">
+      <w:ins w:id="28" w:author="HP" w:date="2026-03-19T10:19:00Z">
         <w:r>
           <w:rPr>
             <w:rFonts w:ascii="Roboto" w:eastAsia="Times New Roman" w:hAnsi="Roboto" w:cs="Arial"/>
@@ -1007,7 +1055,7 @@
             <w:sz w:val="23"/>
             <w:szCs w:val="23"/>
             <w14:ligatures w14:val="none"/>
-            <w:rPrChange w:id="24" w:author="HP" w:date="2026-03-19T10:20:00Z">
+            <w:rPrChange w:id="29" w:author="HP" w:date="2026-03-19T10:20:00Z">
               <w:rPr>
                 <w:rFonts w:ascii="Roboto" w:eastAsia="Times New Roman" w:hAnsi="Roboto" w:cs="Arial"/>
                 <w:color w:val="62748D"/>
@@ -1021,7 +1069,7 @@
           <w:t>dataset for this projec</w:t>
         </w:r>
       </w:ins>
-      <w:ins w:id="25" w:author="HP" w:date="2026-03-19T10:20:00Z">
+      <w:ins w:id="30" w:author="HP" w:date="2026-03-19T10:20:00Z">
         <w:r>
           <w:rPr>
             <w:rFonts w:ascii="Roboto" w:eastAsia="Times New Roman" w:hAnsi="Roboto" w:cs="Arial"/>
@@ -1030,7 +1078,7 @@
             <w:sz w:val="23"/>
             <w:szCs w:val="23"/>
             <w14:ligatures w14:val="none"/>
-            <w:rPrChange w:id="26" w:author="HP" w:date="2026-03-19T10:20:00Z">
+            <w:rPrChange w:id="31" w:author="HP" w:date="2026-03-19T10:20:00Z">
               <w:rPr>
                 <w:rFonts w:ascii="Roboto" w:eastAsia="Times New Roman" w:hAnsi="Roboto" w:cs="Arial"/>
                 <w:color w:val="62748D"/>
@@ -1059,10 +1107,10 @@
     <w:p>
       <w:pPr>
         <w:rPr>
-          <w:ins w:id="27" w:author="HP" w:date="2026-03-19T10:21:00Z"/>
-        </w:rPr>
-      </w:pPr>
-      <w:ins w:id="28" w:author="HP" w:date="2026-03-19T10:21:00Z">
+          <w:ins w:id="32" w:author="HP" w:date="2026-03-19T10:21:00Z"/>
+        </w:rPr>
+      </w:pPr>
+      <w:ins w:id="33" w:author="HP" w:date="2026-03-19T10:21:00Z">
         <w:r>
           <w:t>- Thư viện pháp luật :</w:t>
         </w:r>
@@ -1071,10 +1119,10 @@
     <w:p>
       <w:pPr>
         <w:rPr>
-          <w:ins w:id="29" w:author="HP" w:date="2026-03-19T10:21:00Z"/>
-        </w:rPr>
-      </w:pPr>
-      <w:ins w:id="30" w:author="HP" w:date="2026-03-19T10:21:00Z">
+          <w:ins w:id="34" w:author="HP" w:date="2026-03-19T10:21:00Z"/>
+        </w:rPr>
+      </w:pPr>
+      <w:ins w:id="35" w:author="HP" w:date="2026-03-19T10:21:00Z">
         <w:r>
           <w:t>+ sign_code :</w:t>
         </w:r>
@@ -1083,10 +1131,10 @@
     <w:p>
       <w:pPr>
         <w:rPr>
-          <w:ins w:id="31" w:author="HP" w:date="2026-03-19T10:21:00Z"/>
-        </w:rPr>
-      </w:pPr>
-      <w:ins w:id="32" w:author="HP" w:date="2026-03-19T10:21:00Z">
+          <w:ins w:id="36" w:author="HP" w:date="2026-03-19T10:21:00Z"/>
+        </w:rPr>
+      </w:pPr>
+      <w:ins w:id="37" w:author="HP" w:date="2026-03-19T10:21:00Z">
         <w:r>
           <w:t>+ sign_name :</w:t>
         </w:r>
@@ -1095,10 +1143,10 @@
     <w:p>
       <w:pPr>
         <w:rPr>
-          <w:ins w:id="33" w:author="HP" w:date="2026-03-19T10:21:00Z"/>
-        </w:rPr>
-      </w:pPr>
-      <w:ins w:id="34" w:author="HP" w:date="2026-03-19T10:21:00Z">
+          <w:ins w:id="38" w:author="HP" w:date="2026-03-19T10:21:00Z"/>
+        </w:rPr>
+      </w:pPr>
+      <w:ins w:id="39" w:author="HP" w:date="2026-03-19T10:21:00Z">
         <w:r>
           <w:t>+ sign_type :</w:t>
         </w:r>
@@ -1107,10 +1155,10 @@
     <w:p>
       <w:pPr>
         <w:rPr>
-          <w:ins w:id="35" w:author="HP" w:date="2026-03-19T10:32:00Z"/>
-        </w:rPr>
-      </w:pPr>
-      <w:ins w:id="36" w:author="HP" w:date="2026-03-19T10:22:00Z">
+          <w:ins w:id="40" w:author="HP" w:date="2026-03-19T10:32:00Z"/>
+        </w:rPr>
+      </w:pPr>
+      <w:ins w:id="41" w:author="HP" w:date="2026-03-19T10:22:00Z">
         <w:r>
           <w:t>+ description :</w:t>
         </w:r>
@@ -1119,10 +1167,10 @@
     <w:p>
       <w:pPr>
         <w:rPr>
-          <w:ins w:id="37" w:author="HP" w:date="2026-03-19T10:32:00Z"/>
-        </w:rPr>
-      </w:pPr>
-      <w:ins w:id="38" w:author="HP" w:date="2026-03-19T10:32:00Z">
+          <w:ins w:id="42" w:author="HP" w:date="2026-03-19T10:32:00Z"/>
+        </w:rPr>
+      </w:pPr>
+      <w:ins w:id="43" w:author="HP" w:date="2026-03-19T10:32:00Z">
         <w:r>
           <w:t xml:space="preserve">Ex : </w:t>
         </w:r>
@@ -1131,15 +1179,15 @@
     <w:p>
       <w:pPr>
         <w:rPr>
-          <w:ins w:id="39" w:author="HP" w:date="2026-03-19T10:33:00Z"/>
-        </w:rPr>
-      </w:pPr>
-      <w:ins w:id="40" w:author="HP" w:date="2026-03-19T10:32:00Z">
+          <w:ins w:id="44" w:author="HP" w:date="2026-03-19T10:33:00Z"/>
+        </w:rPr>
+      </w:pPr>
+      <w:ins w:id="45" w:author="HP" w:date="2026-03-19T10:32:00Z">
         <w:r>
           <w:t xml:space="preserve">P.124 : </w:t>
         </w:r>
       </w:ins>
-      <w:ins w:id="41" w:author="HP" w:date="2026-03-19T10:33:00Z">
+      <w:ins w:id="46" w:author="HP" w:date="2026-03-19T10:33:00Z">
         <w:r>
           <w:t>Right turn Alowed</w:t>
         </w:r>
@@ -1148,15 +1196,15 @@
     <w:p>
       <w:pPr>
         <w:rPr>
-          <w:ins w:id="42" w:author="HP" w:date="2026-03-19T10:22:00Z"/>
-        </w:rPr>
-      </w:pPr>
-      <w:ins w:id="43" w:author="HP" w:date="2026-03-19T10:33:00Z">
+          <w:ins w:id="47" w:author="HP" w:date="2026-03-19T10:22:00Z"/>
+        </w:rPr>
+      </w:pPr>
+      <w:ins w:id="48" w:author="HP" w:date="2026-03-19T10:33:00Z">
         <w:r>
           <w:t>P.407 : 1 way</w:t>
         </w:r>
       </w:ins>
-      <w:ins w:id="44" w:author="HP" w:date="2026-03-19T10:34:00Z">
+      <w:ins w:id="49" w:author="HP" w:date="2026-03-19T10:34:00Z">
         <w:r>
           <w:t xml:space="preserve"> road</w:t>
         </w:r>
@@ -1165,10 +1213,10 @@
     <w:p>
       <w:pPr>
         <w:rPr>
-          <w:ins w:id="45" w:author="HP" w:date="2026-03-19T10:34:00Z"/>
-        </w:rPr>
-      </w:pPr>
-      <w:ins w:id="46" w:author="HP" w:date="2026-03-19T10:34:00Z">
+          <w:ins w:id="50" w:author="HP" w:date="2026-03-19T10:34:00Z"/>
+        </w:rPr>
+      </w:pPr>
+      <w:ins w:id="51" w:author="HP" w:date="2026-03-19T10:34:00Z">
         <w:r>
           <w:t>-</w:t>
         </w:r>
@@ -1186,10 +1234,10 @@
     <w:p>
       <w:pPr>
         <w:rPr>
-          <w:ins w:id="47" w:author="HP" w:date="2026-03-19T10:34:00Z"/>
-        </w:rPr>
-      </w:pPr>
-      <w:ins w:id="48" w:author="HP" w:date="2026-03-19T10:34:00Z">
+          <w:ins w:id="52" w:author="HP" w:date="2026-03-19T10:34:00Z"/>
+        </w:rPr>
+      </w:pPr>
+      <w:ins w:id="53" w:author="HP" w:date="2026-03-19T10:34:00Z">
         <w:r>
           <w:t>+ licences_type :</w:t>
         </w:r>
@@ -1198,15 +1246,15 @@
     <w:p>
       <w:pPr>
         <w:rPr>
-          <w:ins w:id="49" w:author="HP" w:date="2026-03-19T10:35:00Z"/>
-        </w:rPr>
-      </w:pPr>
-      <w:ins w:id="50" w:author="HP" w:date="2026-03-19T10:34:00Z">
+          <w:ins w:id="54" w:author="HP" w:date="2026-03-19T10:35:00Z"/>
+        </w:rPr>
+      </w:pPr>
+      <w:ins w:id="55" w:author="HP" w:date="2026-03-19T10:34:00Z">
         <w:r>
           <w:t>+ age_requirem</w:t>
         </w:r>
       </w:ins>
-      <w:ins w:id="51" w:author="HP" w:date="2026-03-19T10:35:00Z">
+      <w:ins w:id="56" w:author="HP" w:date="2026-03-19T10:35:00Z">
         <w:r>
           <w:t>ent :</w:t>
         </w:r>
@@ -1215,10 +1263,10 @@
     <w:p>
       <w:pPr>
         <w:rPr>
-          <w:ins w:id="52" w:author="HP" w:date="2026-03-19T10:35:00Z"/>
-        </w:rPr>
-      </w:pPr>
-      <w:ins w:id="53" w:author="HP" w:date="2026-03-19T10:35:00Z">
+          <w:ins w:id="57" w:author="HP" w:date="2026-03-19T10:35:00Z"/>
+        </w:rPr>
+      </w:pPr>
+      <w:ins w:id="58" w:author="HP" w:date="2026-03-19T10:35:00Z">
         <w:r>
           <w:t>+ condition :</w:t>
         </w:r>
@@ -1227,10 +1275,10 @@
     <w:p>
       <w:pPr>
         <w:rPr>
-          <w:ins w:id="54" w:author="HP" w:date="2026-03-19T10:35:00Z"/>
-        </w:rPr>
-      </w:pPr>
-      <w:ins w:id="55" w:author="HP" w:date="2026-03-19T10:35:00Z">
+          <w:ins w:id="59" w:author="HP" w:date="2026-03-19T10:35:00Z"/>
+        </w:rPr>
+      </w:pPr>
+      <w:ins w:id="60" w:author="HP" w:date="2026-03-19T10:35:00Z">
         <w:r>
           <w:t>Ex :</w:t>
         </w:r>
@@ -1239,33 +1287,33 @@
     <w:p>
       <w:pPr>
         <w:rPr>
-          <w:ins w:id="56" w:author="HP" w:date="2026-03-19T10:35:00Z"/>
-        </w:rPr>
-      </w:pPr>
-      <w:ins w:id="57" w:author="HP" w:date="2026-03-19T10:35:00Z">
+          <w:ins w:id="61" w:author="HP" w:date="2026-03-19T10:35:00Z"/>
+        </w:rPr>
+      </w:pPr>
+      <w:ins w:id="62" w:author="HP" w:date="2026-03-19T10:35:00Z">
         <w:r>
           <w:t xml:space="preserve">A1 , A2 , B1, B2 </w:t>
         </w:r>
-      </w:ins>
-    </w:p>
-    <w:p>
-      <w:pPr>
-        <w:rPr>
-          <w:del w:id="58" w:author="HP" w:date="2026-03-19T10:35:00Z"/>
-        </w:rPr>
-        <w:pPrChange w:id="59" w:author="HP" w:date="2026-03-19T10:35:00Z">
+        <w:bookmarkStart w:id="63" w:name="_GoBack"/>
+        <w:bookmarkEnd w:id="63"/>
+      </w:ins>
+    </w:p>
+    <w:p>
+      <w:pPr>
+        <w:rPr>
+          <w:del w:id="64" w:author="HP" w:date="2026-03-19T10:35:00Z"/>
+        </w:rPr>
+        <w:pPrChange w:id="65" w:author="HP" w:date="2026-03-19T10:35:00Z">
           <w:pPr/>
         </w:pPrChange>
       </w:pPr>
-      <w:bookmarkStart w:id="60" w:name="_GoBack"/>
-      <w:bookmarkEnd w:id="60"/>
-    </w:p>
-    <w:p>
-      <w:pPr>
-        <w:rPr>
-          <w:ins w:id="61" w:author="HP" w:date="2026-03-19T10:34:00Z"/>
-        </w:rPr>
-        <w:pPrChange w:id="62" w:author="HP" w:date="2026-03-19T10:35:00Z">
+    </w:p>
+    <w:p>
+      <w:pPr>
+        <w:rPr>
+          <w:ins w:id="66" w:author="HP" w:date="2026-03-19T10:34:00Z"/>
+        </w:rPr>
+        <w:pPrChange w:id="67" w:author="HP" w:date="2026-03-19T10:35:00Z">
           <w:pPr>
             <w:jc w:val="center"/>
           </w:pPr>
@@ -1274,15 +1322,230 @@
     </w:p>
     <w:p>
       <w:pPr>
-        <w:jc w:val="center"/>
-      </w:pPr>
-      <w:r>
-        <w:rPr>
+        <w:rPr>
+          <w:ins w:id="68" w:author="HP" w:date="2026-03-19T10:39:00Z"/>
           <w:noProof/>
         </w:rPr>
-        <w:lastRenderedPageBreak/>
+        <w:pPrChange w:id="69" w:author="HP" w:date="2026-03-19T10:39:00Z">
+          <w:pPr>
+            <w:jc w:val="center"/>
+          </w:pPr>
+        </w:pPrChange>
+      </w:pPr>
+    </w:p>
+    <w:p>
+      <w:pPr>
+        <w:rPr>
+          <w:ins w:id="70" w:author="HP" w:date="2026-03-19T10:39:00Z"/>
+          <w:noProof/>
+        </w:rPr>
+        <w:pPrChange w:id="71" w:author="HP" w:date="2026-03-19T10:39:00Z">
+          <w:pPr>
+            <w:jc w:val="center"/>
+          </w:pPr>
+        </w:pPrChange>
+      </w:pPr>
+    </w:p>
+    <w:p>
+      <w:pPr>
+        <w:rPr>
+          <w:ins w:id="72" w:author="HP" w:date="2026-03-19T10:39:00Z"/>
+          <w:noProof/>
+        </w:rPr>
+        <w:pPrChange w:id="73" w:author="HP" w:date="2026-03-19T10:39:00Z">
+          <w:pPr>
+            <w:jc w:val="center"/>
+          </w:pPr>
+        </w:pPrChange>
+      </w:pPr>
+    </w:p>
+    <w:p>
+      <w:pPr>
+        <w:rPr>
+          <w:ins w:id="74" w:author="HP" w:date="2026-03-19T10:39:00Z"/>
+          <w:noProof/>
+        </w:rPr>
+        <w:pPrChange w:id="75" w:author="HP" w:date="2026-03-19T10:39:00Z">
+          <w:pPr>
+            <w:jc w:val="center"/>
+          </w:pPr>
+        </w:pPrChange>
+      </w:pPr>
+    </w:p>
+    <w:p>
+      <w:pPr>
+        <w:rPr>
+          <w:ins w:id="76" w:author="HP" w:date="2026-03-19T10:39:00Z"/>
+          <w:noProof/>
+        </w:rPr>
+        <w:pPrChange w:id="77" w:author="HP" w:date="2026-03-19T10:39:00Z">
+          <w:pPr>
+            <w:jc w:val="center"/>
+          </w:pPr>
+        </w:pPrChange>
+      </w:pPr>
+    </w:p>
+    <w:p>
+      <w:pPr>
+        <w:rPr>
+          <w:ins w:id="78" w:author="HP" w:date="2026-03-19T10:39:00Z"/>
+          <w:noProof/>
+        </w:rPr>
+        <w:pPrChange w:id="79" w:author="HP" w:date="2026-03-19T10:39:00Z">
+          <w:pPr>
+            <w:jc w:val="center"/>
+          </w:pPr>
+        </w:pPrChange>
+      </w:pPr>
+    </w:p>
+    <w:p>
+      <w:pPr>
+        <w:pStyle w:val="Heading1"/>
+        <w:rPr>
+          <w:ins w:id="80" w:author="HP" w:date="2026-03-19T10:40:00Z"/>
+          <w:noProof/>
+        </w:rPr>
+        <w:pPrChange w:id="81" w:author="HP" w:date="2026-03-19T10:40:00Z">
+          <w:pPr>
+            <w:jc w:val="center"/>
+          </w:pPr>
+        </w:pPrChange>
+      </w:pPr>
+      <w:ins w:id="82" w:author="HP" w:date="2026-03-19T10:40:00Z">
+        <w:r>
+          <w:rPr>
+            <w:noProof/>
+          </w:rPr>
+          <w:t>III Diagram – Flowchart</w:t>
+        </w:r>
+      </w:ins>
+    </w:p>
+    <w:p>
+      <w:pPr>
+        <w:pStyle w:val="Heading2"/>
+        <w:rPr>
+          <w:ins w:id="83" w:author="HP" w:date="2026-03-19T10:39:00Z"/>
+          <w:noProof/>
+        </w:rPr>
+        <w:pPrChange w:id="84" w:author="HP" w:date="2026-03-19T10:44:00Z">
+          <w:pPr>
+            <w:jc w:val="center"/>
+          </w:pPr>
+        </w:pPrChange>
+      </w:pPr>
+      <w:ins w:id="85" w:author="HP" w:date="2026-03-19T10:40:00Z">
+        <w:r>
+          <w:rPr>
+            <w:noProof/>
+          </w:rPr>
+          <w:t>3.1 UseCase</w:t>
+        </w:r>
+      </w:ins>
+    </w:p>
+    <w:p>
+      <w:pPr>
+        <w:rPr>
+          <w:ins w:id="86" w:author="HP" w:date="2026-03-19T10:44:00Z"/>
+        </w:rPr>
+        <w:pPrChange w:id="87" w:author="HP" w:date="2026-03-19T10:39:00Z">
+          <w:pPr>
+            <w:jc w:val="center"/>
+          </w:pPr>
+        </w:pPrChange>
+      </w:pPr>
+      <w:moveToRangeStart w:id="88" w:author="HP" w:date="2026-03-19T10:40:00Z" w:name="move224809236"/>
+      <w:moveTo w:id="89" w:author="HP" w:date="2026-03-19T10:40:00Z">
+        <w:r>
+          <w:rPr>
+            <w:noProof/>
+          </w:rPr>
+          <w:drawing>
+            <wp:inline distT="0" distB="0" distL="0" distR="0" wp14:anchorId="0A3C6413" wp14:editId="49D7E373">
+              <wp:extent cx="4889500" cy="3409056"/>
+              <wp:effectExtent l="0" t="0" r="6350" b="1270"/>
+              <wp:docPr id="3" name="Picture 3" descr="C:\Users\HP\Downloads\UseCaseAI.png"/>
+              <wp:cNvGraphicFramePr>
+                <a:graphicFrameLocks xmlns:a="http://schemas.openxmlformats.org/drawingml/2006/main" noChangeAspect="1"/>
+              </wp:cNvGraphicFramePr>
+              <a:graphic xmlns:a="http://schemas.openxmlformats.org/drawingml/2006/main">
+                <a:graphicData uri="http://schemas.openxmlformats.org/drawingml/2006/picture">
+                  <pic:pic xmlns:pic="http://schemas.openxmlformats.org/drawingml/2006/picture">
+                    <pic:nvPicPr>
+                      <pic:cNvPr id="0" name="Picture 1" descr="C:\Users\HP\Downloads\UseCaseAI.png"/>
+                      <pic:cNvPicPr>
+                        <a:picLocks noChangeAspect="1" noChangeArrowheads="1"/>
+                      </pic:cNvPicPr>
+                    </pic:nvPicPr>
+                    <pic:blipFill>
+                      <a:blip r:embed="rId5">
+                        <a:extLst>
+                          <a:ext uri="{28A0092B-C50C-407E-A947-70E740481C1C}">
+                            <a14:useLocalDpi xmlns:a14="http://schemas.microsoft.com/office/drawing/2010/main" val="0"/>
+                          </a:ext>
+                        </a:extLst>
+                      </a:blip>
+                      <a:srcRect/>
+                      <a:stretch>
+                        <a:fillRect/>
+                      </a:stretch>
+                    </pic:blipFill>
+                    <pic:spPr bwMode="auto">
+                      <a:xfrm>
+                        <a:off x="0" y="0"/>
+                        <a:ext cx="4901971" cy="3417751"/>
+                      </a:xfrm>
+                      <a:prstGeom prst="rect">
+                        <a:avLst/>
+                      </a:prstGeom>
+                      <a:noFill/>
+                      <a:ln>
+                        <a:noFill/>
+                      </a:ln>
+                    </pic:spPr>
+                  </pic:pic>
+                </a:graphicData>
+              </a:graphic>
+            </wp:inline>
+          </w:drawing>
+        </w:r>
+      </w:moveTo>
+      <w:moveToRangeEnd w:id="88"/>
+    </w:p>
+    <w:p>
+      <w:pPr>
+        <w:pStyle w:val="Heading2"/>
+        <w:rPr>
+          <w:ins w:id="90" w:author="HP" w:date="2026-03-19T10:44:00Z"/>
+        </w:rPr>
+        <w:pPrChange w:id="91" w:author="HP" w:date="2026-03-19T10:47:00Z">
+          <w:pPr>
+            <w:jc w:val="center"/>
+          </w:pPr>
+        </w:pPrChange>
+      </w:pPr>
+      <w:ins w:id="92" w:author="HP" w:date="2026-03-19T10:44:00Z">
+        <w:r>
+          <w:t>3.2 . Activity of Chatbot System</w:t>
+        </w:r>
+      </w:ins>
+    </w:p>
+    <w:p>
+      <w:pPr>
+        <w:rPr>
+          <w:ins w:id="93" w:author="HP" w:date="2026-03-19T10:47:00Z"/>
+        </w:rPr>
+        <w:pPrChange w:id="94" w:author="HP" w:date="2026-03-19T10:39:00Z">
+          <w:pPr>
+            <w:jc w:val="center"/>
+          </w:pPr>
+        </w:pPrChange>
+      </w:pPr>
+      <w:r>
+        <w:rPr>
+          <w:noProof/>
+        </w:rPr>
         <w:drawing>
-          <wp:inline distT="0" distB="0" distL="0" distR="0" wp14:anchorId="00D3D5DE" wp14:editId="59C04977">
+          <wp:inline distT="0" distB="0" distL="0" distR="0" wp14:anchorId="5AD975E6" wp14:editId="638CE832">
             <wp:extent cx="4806950" cy="3247485"/>
             <wp:effectExtent l="0" t="0" r="0" b="0"/>
             <wp:docPr id="2" name="Picture 2" descr="C:\Users\HP\Downloads\FlowChartAI.png"/>
@@ -1299,7 +1562,7 @@
                     </pic:cNvPicPr>
                   </pic:nvPicPr>
                   <pic:blipFill>
-                    <a:blip r:embed="rId5">
+                    <a:blip r:embed="rId6">
                       <a:extLst>
                         <a:ext uri="{28A0092B-C50C-407E-A947-70E740481C1C}">
                           <a14:useLocalDpi xmlns:a14="http://schemas.microsoft.com/office/drawing/2010/main" val="0"/>
@@ -1333,61 +1596,139 @@
     </w:p>
     <w:p>
       <w:pPr>
-        <w:jc w:val="center"/>
-      </w:pPr>
-      <w:r>
-        <w:rPr>
-          <w:noProof/>
-        </w:rPr>
-        <w:drawing>
-          <wp:inline distT="0" distB="0" distL="0" distR="0">
-            <wp:extent cx="4889500" cy="3409056"/>
-            <wp:effectExtent l="0" t="0" r="6350" b="1270"/>
-            <wp:docPr id="1" name="Picture 1" descr="C:\Users\HP\Downloads\UseCaseAI.png"/>
-            <wp:cNvGraphicFramePr>
-              <a:graphicFrameLocks xmlns:a="http://schemas.openxmlformats.org/drawingml/2006/main" noChangeAspect="1"/>
-            </wp:cNvGraphicFramePr>
-            <a:graphic xmlns:a="http://schemas.openxmlformats.org/drawingml/2006/main">
-              <a:graphicData uri="http://schemas.openxmlformats.org/drawingml/2006/picture">
-                <pic:pic xmlns:pic="http://schemas.openxmlformats.org/drawingml/2006/picture">
-                  <pic:nvPicPr>
-                    <pic:cNvPr id="0" name="Picture 1" descr="C:\Users\HP\Downloads\UseCaseAI.png"/>
-                    <pic:cNvPicPr>
-                      <a:picLocks noChangeAspect="1" noChangeArrowheads="1"/>
-                    </pic:cNvPicPr>
-                  </pic:nvPicPr>
-                  <pic:blipFill>
-                    <a:blip r:embed="rId6">
-                      <a:extLst>
-                        <a:ext uri="{28A0092B-C50C-407E-A947-70E740481C1C}">
-                          <a14:useLocalDpi xmlns:a14="http://schemas.microsoft.com/office/drawing/2010/main" val="0"/>
-                        </a:ext>
-                      </a:extLst>
-                    </a:blip>
-                    <a:srcRect/>
-                    <a:stretch>
-                      <a:fillRect/>
-                    </a:stretch>
-                  </pic:blipFill>
-                  <pic:spPr bwMode="auto">
-                    <a:xfrm>
-                      <a:off x="0" y="0"/>
-                      <a:ext cx="4901971" cy="3417751"/>
-                    </a:xfrm>
-                    <a:prstGeom prst="rect">
-                      <a:avLst/>
-                    </a:prstGeom>
-                    <a:noFill/>
-                    <a:ln>
+        <w:pPrChange w:id="95" w:author="HP" w:date="2026-03-19T10:39:00Z">
+          <w:pPr>
+            <w:jc w:val="center"/>
+          </w:pPr>
+        </w:pPrChange>
+      </w:pPr>
+    </w:p>
+    <w:p>
+      <w:pPr>
+        <w:pStyle w:val="Heading2"/>
+        <w:rPr>
+          <w:ins w:id="96" w:author="HP" w:date="2026-03-19T10:47:00Z"/>
+        </w:rPr>
+        <w:pPrChange w:id="97" w:author="HP" w:date="2026-03-19T10:47:00Z">
+          <w:pPr>
+            <w:jc w:val="center"/>
+          </w:pPr>
+        </w:pPrChange>
+      </w:pPr>
+      <w:ins w:id="98" w:author="HP" w:date="2026-03-19T10:44:00Z">
+        <w:r>
+          <w:lastRenderedPageBreak/>
+          <w:t xml:space="preserve">3.3 Architechure </w:t>
+        </w:r>
+      </w:ins>
+    </w:p>
+    <w:p>
+      <w:pPr>
+        <w:pPrChange w:id="99" w:author="HP" w:date="2026-03-19T10:44:00Z">
+          <w:pPr>
+            <w:jc w:val="center"/>
+          </w:pPr>
+        </w:pPrChange>
+      </w:pPr>
+      <w:ins w:id="100" w:author="HP" w:date="2026-03-19T10:47:00Z">
+        <w:r>
+          <w:drawing>
+            <wp:inline distT="0" distB="0" distL="0" distR="0" wp14:anchorId="737B747C" wp14:editId="35BFA531">
+              <wp:extent cx="5943600" cy="3121660"/>
+              <wp:effectExtent l="0" t="0" r="0" b="2540"/>
+              <wp:docPr id="4" name="Picture 4"/>
+              <wp:cNvGraphicFramePr>
+                <a:graphicFrameLocks xmlns:a="http://schemas.openxmlformats.org/drawingml/2006/main" noChangeAspect="1"/>
+              </wp:cNvGraphicFramePr>
+              <a:graphic xmlns:a="http://schemas.openxmlformats.org/drawingml/2006/main">
+                <a:graphicData uri="http://schemas.openxmlformats.org/drawingml/2006/picture">
+                  <pic:pic xmlns:pic="http://schemas.openxmlformats.org/drawingml/2006/picture">
+                    <pic:nvPicPr>
+                      <pic:cNvPr id="1" name=""/>
+                      <pic:cNvPicPr/>
+                    </pic:nvPicPr>
+                    <pic:blipFill>
+                      <a:blip r:embed="rId7"/>
+                      <a:stretch>
+                        <a:fillRect/>
+                      </a:stretch>
+                    </pic:blipFill>
+                    <pic:spPr>
+                      <a:xfrm>
+                        <a:off x="0" y="0"/>
+                        <a:ext cx="5943600" cy="3121660"/>
+                      </a:xfrm>
+                      <a:prstGeom prst="rect">
+                        <a:avLst/>
+                      </a:prstGeom>
+                    </pic:spPr>
+                  </pic:pic>
+                </a:graphicData>
+              </a:graphic>
+            </wp:inline>
+          </w:drawing>
+        </w:r>
+        <w:r>
+          <w:t xml:space="preserve"> </w:t>
+        </w:r>
+      </w:ins>
+      <w:moveFromRangeStart w:id="101" w:author="HP" w:date="2026-03-19T10:40:00Z" w:name="move224809236"/>
+      <w:moveFrom w:id="102" w:author="HP" w:date="2026-03-19T10:40:00Z">
+        <w:r>
+          <w:rPr>
+            <w:noProof/>
+          </w:rPr>
+          <w:drawing>
+            <wp:inline distT="0" distB="0" distL="0" distR="0" wp14:anchorId="3C54AB12" wp14:editId="17339D38">
+              <wp:extent cx="4889500" cy="3409056"/>
+              <wp:effectExtent l="0" t="0" r="6350" b="1270"/>
+              <wp:docPr id="1" name="Picture 1" descr="C:\Users\HP\Downloads\UseCaseAI.png"/>
+              <wp:cNvGraphicFramePr>
+                <a:graphicFrameLocks xmlns:a="http://schemas.openxmlformats.org/drawingml/2006/main" noChangeAspect="1"/>
+              </wp:cNvGraphicFramePr>
+              <a:graphic xmlns:a="http://schemas.openxmlformats.org/drawingml/2006/main">
+                <a:graphicData uri="http://schemas.openxmlformats.org/drawingml/2006/picture">
+                  <pic:pic xmlns:pic="http://schemas.openxmlformats.org/drawingml/2006/picture">
+                    <pic:nvPicPr>
+                      <pic:cNvPr id="0" name="Picture 1" descr="C:\Users\HP\Downloads\UseCaseAI.png"/>
+                      <pic:cNvPicPr>
+                        <a:picLocks noChangeAspect="1" noChangeArrowheads="1"/>
+                      </pic:cNvPicPr>
+                    </pic:nvPicPr>
+                    <pic:blipFill>
+                      <a:blip r:embed="rId5">
+                        <a:extLst>
+                          <a:ext uri="{28A0092B-C50C-407E-A947-70E740481C1C}">
+                            <a14:useLocalDpi xmlns:a14="http://schemas.microsoft.com/office/drawing/2010/main" val="0"/>
+                          </a:ext>
+                        </a:extLst>
+                      </a:blip>
+                      <a:srcRect/>
+                      <a:stretch>
+                        <a:fillRect/>
+                      </a:stretch>
+                    </pic:blipFill>
+                    <pic:spPr bwMode="auto">
+                      <a:xfrm>
+                        <a:off x="0" y="0"/>
+                        <a:ext cx="4901971" cy="3417751"/>
+                      </a:xfrm>
+                      <a:prstGeom prst="rect">
+                        <a:avLst/>
+                      </a:prstGeom>
                       <a:noFill/>
-                    </a:ln>
-                  </pic:spPr>
-                </pic:pic>
-              </a:graphicData>
-            </a:graphic>
-          </wp:inline>
-        </w:drawing>
-      </w:r>
+                      <a:ln>
+                        <a:noFill/>
+                      </a:ln>
+                    </pic:spPr>
+                  </pic:pic>
+                </a:graphicData>
+              </a:graphic>
+            </wp:inline>
+          </w:drawing>
+        </w:r>
+      </w:moveFrom>
+      <w:moveFromRangeEnd w:id="101"/>
     </w:p>
     <w:sectPr>
       <w:pgSz w:w="12240" w:h="15840"/>
@@ -1959,6 +2300,38 @@
       <w:bCs/>
     </w:rPr>
   </w:style>
+  <w:style w:type="paragraph" w:styleId="BalloonText">
+    <w:name w:val="Balloon Text"/>
+    <w:basedOn w:val="Normal"/>
+    <w:link w:val="BalloonTextChar"/>
+    <w:uiPriority w:val="99"/>
+    <w:semiHidden/>
+    <w:unhideWhenUsed/>
+    <w:rsid w:val="00BE1DF0"/>
+    <w:pPr>
+      <w:spacing w:before="0" w:after="0"/>
+    </w:pPr>
+    <w:rPr>
+      <w:rFonts w:ascii="Segoe UI" w:hAnsi="Segoe UI" w:cs="Segoe UI"/>
+      <w:sz w:val="18"/>
+      <w:szCs w:val="18"/>
+    </w:rPr>
+  </w:style>
+  <w:style w:type="character" w:customStyle="1" w:styleId="BalloonTextChar">
+    <w:name w:val="Balloon Text Char"/>
+    <w:basedOn w:val="DefaultParagraphFont"/>
+    <w:link w:val="BalloonText"/>
+    <w:uiPriority w:val="99"/>
+    <w:semiHidden/>
+    <w:rsid w:val="00BE1DF0"/>
+    <w:rPr>
+      <w:rFonts w:ascii="Segoe UI" w:hAnsi="Segoe UI" w:cs="Segoe UI"/>
+      <w:kern w:val="2"/>
+      <w:sz w:val="18"/>
+      <w:szCs w:val="18"/>
+      <w14:ligatures w14:val="standardContextual"/>
+    </w:rPr>
+  </w:style>
 </w:styles>
 </file>
 
@@ -2228,7 +2601,7 @@
 </file>
 
 <file path=customXml/itemProps1.xml><?xml version="1.0" encoding="utf-8"?>
-<ds:datastoreItem xmlns:ds="http://schemas.openxmlformats.org/officeDocument/2006/customXml" ds:itemID="{A0B937FE-F215-4533-913A-8C88B1A9F8B4}">
+<ds:datastoreItem xmlns:ds="http://schemas.openxmlformats.org/officeDocument/2006/customXml" ds:itemID="{B2021B76-560B-4C85-8575-D89B5A5ABCC4}">
   <ds:schemaRefs>
     <ds:schemaRef ds:uri="http://schemas.openxmlformats.org/officeDocument/2006/bibliography"/>
   </ds:schemaRefs>

</xml_diff>